<commit_message>
Remove online appendix dependencies from manuscript body
Co-Authored-By: Claude Sonnet 5.5 <noreply@anthropic.com>
Claude-Session: https://claude.ai/code/session_01LBjWUD7hbjfvwUj9dX3gFd
</commit_message>
<xml_diff>
--- a/IM_manuscript_Cheap_Code_Costly_Choices.docx
+++ b/IM_manuscript_Cheap_Code_Costly_Choices.docx
@@ -516,7 +516,7 @@
           <w:i w:val="false"/>
           <w:iCs w:val="false"/>
         </w:rPr>
-        <w:t xml:space="preserve">The remainder of the paper is organized as follows. Section 2 reviews the background. Section 3 develops the theory and its rational rival, Section 4 formalizes it, and Section 5 states its empirical implications. Section 6 discusses contributions and limitations, and Section 7 concludes. The Online Appendix contains the proofs, an agent-based extension to teams, and two additional results.</w:t>
+        <w:t xml:space="preserve">The remainder of the paper is organized as follows. Section 2 reviews the background. Section 3 develops the theory and its rational rival, Section 4 formalizes it, and Section 5 states its empirical implications. Section 6 discusses contributions and limitations, and Section 7 concludes.</w:t>
       </w:r>
     </w:p>
     <w:p>
@@ -968,7 +968,7 @@
           <w:i w:val="false"/>
           <w:iCs w:val="false"/>
         </w:rPr>
-        <w:t xml:space="preserve">Table 1 lists the mechanisms and the eleven propositions they imply. The propositions are the empirical hypotheses of the verbal theory. Section 4 formalizes the timing, appearance, and possession mechanisms at the level of a single decision, and Online Appendix A carries the ownership and incentive mechanisms over to teams.</w:t>
+        <w:t xml:space="preserve">Table 1 lists the mechanisms and the eleven propositions they imply. The propositions are the empirical hypotheses of the verbal theory. Section 4 formalizes the timing, appearance, and possession mechanisms at the level of a single decision. The ownership and incentive mechanisms (P6 and P9 to P11) enter the paper as propositions to be tested and are not formalized here.</w:t>
       </w:r>
     </w:p>
     <w:p>
@@ -4018,7 +4018,7 @@
           <w:i w:val="false"/>
           <w:iCs w:val="false"/>
         </w:rPr>
-        <w:t xml:space="preserve">This section formalizes the frame shift. The model is deliberately minimal, with one developer, one task at a time, and four behavioral wedges, each corresponding to a component of the frame shift in Section 3. Present bias expresses timing, a perception wedge expresses appearance, and a default share and loss aversion express possession. The purpose of the model is to establish results that the verbal theory suggests but cannot prove: when debt rises as quality becomes cheaper, what can and cannot separate the behavioral theory from rational acceleration, how debt responds to better models, and how it evolves over time. Section 4.6 then places the developer in a game with a tool vendor and her organization. Proofs are in Online Appendix B. Every result was also verified numerically, and the illustrative values below come from those computations.</w:t>
+        <w:t xml:space="preserve">This section formalizes the frame shift. The model is deliberately minimal, with one developer, one task at a time, and four behavioral wedges, each corresponding to a component of the frame shift in Section 3. Present bias expresses timing, a perception wedge expresses appearance, and a default share and loss aversion express possession. The purpose of the model is to establish results that the verbal theory suggests but cannot prove: when debt rises as quality becomes cheaper, what can and cannot separate the behavioral theory from rational acceleration, how debt responds to better models, and how it evolves over time. Section 4.6 then places the developer in a game with a tool vendor and her organization. Every result was also verified numerically, and the illustrative values below come from those computations.</w:t>
       </w:r>
     </w:p>
     <w:p>
@@ -6627,7 +6627,7 @@
           <w:i w:val="false"/>
           <w:iCs w:val="false"/>
         </w:rPr>
-        <w:t xml:space="preserve"> only as far as developers are willing to comply, so enforcement against unsanctioned tools and choice architecture are complements. Third, as Figure 3 shows, the organization’s optimal friction is not monotone in the wedges. The closed forms rely on a quadratic friction cost and a constant rework cost, but the sign results do not: Online Appendix B shows that f</w:t>
+        <w:t xml:space="preserve"> only as far as developers are willing to comply, so enforcement against unsanctioned tools and choice architecture are complements. Third, as Figure 3 shows, the organization’s optimal friction is not monotone in the wedges. The closed forms rely on a quadratic friction cost and a constant rework cost. The sign result, f</w:t>
       </w:r>
       <w:r>
         <w:rPr>
@@ -6669,7 +6669,28 @@
           <w:i w:val="false"/>
           <w:iCs w:val="false"/>
         </w:rPr>
-        <w:t xml:space="preserve">, with equality if and only if no wedge binds, for any convex friction cost, any decreasing and convex default share, any distribution of inspection time, and heterogeneous rework costs.</w:t>
+        <w:t xml:space="preserve"> with equality if and only if no wedge binds, depends on the gap between Δ and Δ</w:t>
+      </w:r>
+      <w:r>
+        <w:rPr>
+          <w:rFonts w:ascii="Times New Roman" w:cs="Times New Roman" w:eastAsia="Times New Roman" w:hAnsi="Times New Roman"/>
+          <w:b w:val="false"/>
+          <w:bCs w:val="false"/>
+          <w:i w:val="false"/>
+          <w:iCs w:val="false"/>
+          <w:vertAlign w:val="subscript"/>
+        </w:rPr>
+        <w:t xml:space="preserve">p</w:t>
+      </w:r>
+      <w:r>
+        <w:rPr>
+          <w:rFonts w:ascii="Times New Roman" w:cs="Times New Roman" w:eastAsia="Times New Roman" w:hAnsi="Times New Roman"/>
+          <w:b w:val="false"/>
+          <w:bCs w:val="false"/>
+          <w:i w:val="false"/>
+          <w:iCs w:val="false"/>
+        </w:rPr>
+        <w:t xml:space="preserve"> rather than on those functional forms, and we conjecture that it survives other convex friction costs, other default-share functions, other distributions of inspection time, and heterogeneous rework costs; we have not established the general case here.</w:t>
       </w:r>
     </w:p>
     <w:p>
@@ -7198,7 +7219,7 @@
           <w:i w:val="false"/>
           <w:iCs w:val="false"/>
         </w:rPr>
-        <w:t xml:space="preserve">The model formalizes the frame shift at the level of a single decision. Present bias generates P1 and P2, the perception wedge generates P3, P4, and P7, the default share generates P8, and loss aversion generates the retention component of P5. Results 1 and 2 ground the contrast with rational acceleration in Table 2, and Results 3 to 8 add predictions that the verbal theory does not make. Online Appendix C reports two further results: the sign of a mandate’s effect on maintenance cost is diagnostic of the wedges (Result S1), and acceptance-linked vendor revenue lowers friction equally under both governance modes, which leaves the test of Result 6 intact (Result S2). Online Appendix A extends the model to teams, where ownership, moral hazard, rebound, and metric targeting operate.</w:t>
+        <w:t xml:space="preserve">The model formalizes the frame shift at the level of a single decision. Present bias generates P1 and P2, the perception wedge generates P3, P4, and P7, the default share generates P8, and loss aversion generates the retention component of P5. Results 1 and 2 ground the contrast with rational acceleration in Table 2, and Results 3 to 8 add predictions that the verbal theory does not make. The ownership and incentive mechanisms (P6 and P9 to P11) are not formalized; extending the model to teams, where ownership, moral hazard, rebound, and metric targeting operate, is left for future work.</w:t>
       </w:r>
     </w:p>
     <w:p>
@@ -7232,7 +7253,7 @@
           <w:i w:val="false"/>
           <w:iCs w:val="false"/>
         </w:rPr>
-        <w:t xml:space="preserve">The contribution of this paper is theoretical, but the theory and the model are built to be tested. This section states what evidence would bear on them and what would count against them. Online Appendix A shows by simulation that the proposed archival measures can separate the mechanisms and the two accounts.</w:t>
+        <w:t xml:space="preserve">The contribution of this paper is theoretical, but the theory and the model are built to be tested. This section states what evidence would bear on them and what would count against them.</w:t>
       </w:r>
     </w:p>
     <w:p>
@@ -7518,7 +7539,7 @@
           <w:i w:val="false"/>
           <w:iCs w:val="false"/>
         </w:rPr>
-        <w:t xml:space="preserve">The theory and model are developed here rather than tested; the propositions and results await the evidence that the design in Section 5 would produce. The formal model is deliberately minimal. Tasks are independent, inspection detects defects perfectly, and the debt-trap result relies on a particular form of interest on debt, so its results are statements about mechanisms and not calibrated magnitudes. The strategic extensions abstract from competition among the organizations that use the tools, and they model learning only about the defect rate, not about the heuristic component of fluency, which may resist statistical evidence. The simulation in Online Appendix A shows that the design can separate the mechanisms and the two accounts if they operate as theorized; because every effect in it is assumed, it is not evidence that they do. Several measurement challenges also remain unresolved. AI-authorship labels are noisy and probably understate usage, which biases Study 1 estimates toward zero. Static-analysis measures of debt are proxies that may not track the debt developers experience. The experiment’s cover story may not fully reproduce field conditions in which reviewers know which tools their colleagues use. Finally, the theory is silent on model capability. A sufficiently capable model might produce code whose surface fluency is matched by its structure, and the fluency mechanism would then become harmless. The evidence to date, which finds structural degradation increasing with model capability, suggests that this point has not been reached, but the theory should be understood as conditional on the current gap between apparent and actual quality.</w:t>
+        <w:t xml:space="preserve">The theory and model are developed here rather than tested; the propositions and results await the evidence that the design in Section 5 would produce. The formal model is deliberately minimal. Tasks are independent, inspection detects defects perfectly, and the debt-trap result relies on a particular form of interest on debt, so its results are statements about mechanisms and not calibrated magnitudes. The strategic extensions abstract from competition among the organizations that use the tools, and they model learning only about the defect rate, not about the heuristic component of fluency, which may resist statistical evidence. The ownership and incentive mechanisms, and with them Propositions 6 and 9 to 11, are stated verbally and are not formalized, and we have not verified by simulation that the proposed measures can separate the mechanisms and the two accounts. Several measurement challenges also remain unresolved. AI-authorship labels are noisy and probably understate usage, which biases Study 1 estimates toward zero. Static-analysis measures of debt are proxies that may not track the debt developers experience. The experiment’s cover story may not fully reproduce field conditions in which reviewers know which tools their colleagues use. Finally, the theory is silent on model capability. A sufficiently capable model might produce code whose surface fluency is matched by its structure, and the fluency mechanism would then become harmless. The evidence to date, which finds structural degradation increasing with model capability, suggests that this point has not been reached, but the theory should be understood as conditional on the current gap between apparent and actual quality.</w:t>
       </w:r>
     </w:p>
     <w:p>
@@ -7554,7 +7575,7 @@
           <w:i w:val="false"/>
           <w:iCs w:val="false"/>
         </w:rPr>
-        <w:t xml:space="preserve">Three extensions suggest themselves. First, the theory could be applied to other generative-AI artifacts, such as documentation, infrastructure configuration, and analytics notebooks, where the same mechanisms plausibly operate but the debt has not been named. Second, the propositions could be tested at the level of the individual developer over time, asking whether biases attenuate with experience or, as some automation-bias research suggests, intensify as trust accumulates. Third, the choice-architecture interventions in Section 6.2 could be studied as field experiments, which would provide both a test of the mechanisms and direct evidence on remedies. As Result S1 in Online Appendix C shows, the sign of such an intervention’s effect on maintenance cost is itself a test of the wedges.</w:t>
+        <w:t xml:space="preserve">Three extensions suggest themselves. First, the theory could be applied to other generative-AI artifacts, such as documentation, infrastructure configuration, and analytics notebooks, where the same mechanisms plausibly operate but the debt has not been named. Second, the propositions could be tested at the level of the individual developer over time, asking whether biases attenuate with experience or, as some automation-bias research suggests, intensify as trust accumulates. Third, the choice-architecture interventions in Section 6.2 could be studied as field experiments, which would provide both a test of the mechanisms and direct evidence on remedies. Extending the formal model to teams would also allow the incentive mechanisms to be analyzed jointly with the behavioral wedges.</w:t>
       </w:r>
     </w:p>
     <w:p>

</xml_diff>

<commit_message>
Add pilot P4 test (Aider repository) to manuscript
Co-Authored-By: Claude Sonnet 5.5 <noreply@anthropic.com>
Claude-Session: https://claude.ai/code/session_01LBjWUD7hbjfvwUj9dX3gFd
</commit_message>
<xml_diff>
--- a/IM_manuscript_Cheap_Code_Costly_Choices.docx
+++ b/IM_manuscript_Cheap_Code_Costly_Choices.docx
@@ -258,7 +258,7 @@
           <w:sz w:val="24"/>
           <w:szCs w:val="24"/>
         </w:rPr>
-        <w:t xml:space="preserve">Eleven propositions and three studies set out testable predictions</w:t>
+        <w:t xml:space="preserve">Pilot on a public repository: LLM commits carry far fewer self-admitted debt markers</w:t>
       </w:r>
     </w:p>
     <w:p>
@@ -321,7 +321,7 @@
           <w:i w:val="false"/>
           <w:iCs w:val="false"/>
         </w:rPr>
-        <w:t xml:space="preserve">Large language model (LLM) coding assistants have sharply lowered the cost of producing working code, yet maintainability appears to be deteriorating. A rational trade-off view of technical debt predicts less debt as clean code gets cheaper, although a rational account can produce rising debt if faster delivery raises the value of speed. We propose a behavioral theory built on a frame shift: assistance converts an ex ante choice between an expedient and a quality implementation into an ex post decision about accepting an artifact that already exists, works, and looks finished. A formal model with present-bias, perception, default, and loss-aversion wedges shows that debt can rise as quality gets cheaper, that more reliable models can generate more debt, and that present bias creates debt traps with hysteresis. Rational acceleration can match aggregate debt but not three other statistics. We derive testable propositions and recast technical debt as a choice-architecture problem.</w:t>
+        <w:t xml:space="preserve">Large language model (LLM) coding assistants have lowered the cost of producing working code, yet maintainability appears to be deteriorating. A rational trade-off view of technical debt predicts less debt as clean code gets cheaper, although faster delivery can raise the value of speed and debt with it. We propose a behavioral theory built on a frame shift: assistance converts an ex ante choice between an expedient and a quality implementation into an ex post decision about accepting an artifact that already exists, works, and looks finished. A formal model with four behavioral wedges shows that debt can rise as quality gets cheaper, that more reliable models can generate more debt, and that present bias creates debt traps with hysteresis. Rational acceleration can match aggregate debt but not three other statistics, and a pilot test points the way the behavioral theory predicts. We recast technical debt as a choice-architecture problem.</w:t>
       </w:r>
     </w:p>
     <w:p>
@@ -516,7 +516,7 @@
           <w:i w:val="false"/>
           <w:iCs w:val="false"/>
         </w:rPr>
-        <w:t xml:space="preserve">The remainder of the paper is organized as follows. Section 2 reviews the background. Section 3 develops the theory and its rational rival, Section 4 formalizes it, and Section 5 states its empirical implications. Section 6 discusses contributions and limitations, and Section 7 concludes.</w:t>
+        <w:t xml:space="preserve">The remainder of the paper is organized as follows. Section 2 reviews the background. Section 3 develops the theory and its rational rival, Section 4 formalizes it, and Section 5 states its empirical implications and reports a pilot test of one of them. Section 6 discusses contributions and limitations, and Section 7 concludes.</w:t>
       </w:r>
     </w:p>
     <w:p>
@@ -9701,7 +9701,7 @@
           <w:i w:val="false"/>
           <w:iCs w:val="false"/>
         </w:rPr>
-        <w:t xml:space="preserve">The contribution of this paper is theoretical, but the theory and the model are built to be tested. This section states what evidence would bear on them and what would count against them.</w:t>
+        <w:t xml:space="preserve">The contribution of this paper is theoretical, but the theory and the model are built to be tested. This section states what evidence would bear on them and what would count against them, and Section 5.1 reports a pilot test of one proposition.</w:t>
       </w:r>
     </w:p>
     <w:p>
@@ -9738,6 +9738,857 @@
           <w:iCs w:val="false"/>
         </w:rPr>
         <w:t xml:space="preserve">Public repositories in which LLM authorship can be identified, whether through co-author trailers, agent-opened pull requests, or assistant configuration files, support a staggered difference-in-differences comparison of adopting and non-adopting repositories, as well as change-level comparisons within repositories and reviewers. The model dictates the measures. Aggregate debt is reported but cannot adjudicate between the accounts (Result 2a). The adjudicating statistics are the self-admission rate of a change conditional on the static-analysis warnings it introduces (P4), the substantive review a change receives with reviewer fixed effects (P7), and the net-addition bias in single-contributor modules (P5). Refactoring is measured as commits per active contributor and not as a share of changed lines, which rebound would contaminate (P1a), and duplication that grows with contributor count identifies rebound rather than loss aversion (P10). The same data test the dynamic results: after adoption, the cross-repository distribution of debt should become bimodal, and repositories that enter adoption with more debt should be more likely to tip (Result 4). Within repositories that switch model generations, debt per LLM-assisted change should not fall monotonically with model reliability (Result 3).</w:t>
+      </w:r>
+    </w:p>
+    <w:p>
+      <w:pPr>
+        <w:spacing w:after="0" w:line="480" w:lineRule="auto"/>
+        <w:ind w:firstLine="720"/>
+      </w:pPr>
+      <w:r>
+        <w:rPr>
+          <w:rFonts w:ascii="Times New Roman" w:cs="Times New Roman" w:eastAsia="Times New Roman" w:hAnsi="Times New Roman"/>
+          <w:b/>
+          <w:bCs/>
+        </w:rPr>
+        <w:t xml:space="preserve">Pilot test of P4. </w:t>
+      </w:r>
+      <w:r>
+        <w:rPr>
+          <w:rFonts w:ascii="Times New Roman" w:cs="Times New Roman" w:eastAsia="Times New Roman" w:hAnsi="Times New Roman"/>
+          <w:b w:val="false"/>
+          <w:bCs w:val="false"/>
+          <w:i w:val="false"/>
+          <w:iCs w:val="false"/>
+        </w:rPr>
+        <w:t xml:space="preserve">As a first check, we tested P4 on the public history of the Aider repository (Aider-AI, 2026). The repository suits the purpose for two reasons. The tool marks the changes it writes by appending “(aider)” to the commit author’s name, which identifies LLM authorship directly, and one maintainer wrote most commits both with and without the tag, so much of the comparison is within a single developer. The analysis is exploratory and was not preregistered.</w:t>
+      </w:r>
+    </w:p>
+    <w:p>
+      <w:pPr>
+        <w:spacing w:after="0" w:line="480" w:lineRule="auto"/>
+        <w:ind w:firstLine="720"/>
+      </w:pPr>
+      <w:r>
+        <w:rPr>
+          <w:rFonts w:ascii="Times New Roman" w:cs="Times New Roman" w:eastAsia="Times New Roman" w:hAnsi="Times New Roman"/>
+          <w:b/>
+          <w:bCs/>
+        </w:rPr>
+        <w:t xml:space="preserve">Data and measures. </w:t>
+      </w:r>
+      <w:r>
+        <w:rPr>
+          <w:rFonts w:ascii="Times New Roman" w:cs="Times New Roman" w:eastAsia="Times New Roman" w:hAnsi="Times New Roman"/>
+          <w:b w:val="false"/>
+          <w:bCs w:val="false"/>
+          <w:i w:val="false"/>
+          <w:iCs w:val="false"/>
+        </w:rPr>
+        <w:t xml:space="preserve">We used the full history to May 2026 (13,138 commits) and kept the commits that add at least one line of Python after the author tag first appears, on 18 June 2024. This leaves 4,936 commits, of which 2,801 are LLM-authored and 2,135 human-authored, and one maintainer authored 4,707 of them. The tag no longer appears after the second quarter of 2025, so we include quarter fixed effects to absorb the change in composition. Self-admitted debt is the number of added comment lines containing TODO, FIXME, HACK, XXX, KLUDGE, or WORKAROUND (30 events; the strict measure). Because these markers turned out to be rare, we also report a broader measure, fixed after seeing the counts, that adds phrases such as “for now,” “temporary,” “quick fix,” “ugly,” and “refactor later” (121 events). Statically detected debt introduced is the increase, summed over the files a commit changes, in the number of warnings from the ruff linter (Astral, 2026) for excess complexity, too many branches, arguments, statements, or returns, magic values, simplifiable code, commented-out code, and likely bugs, computed on the parent and child versions of each file with suppression comments ignored.</w:t>
+      </w:r>
+    </w:p>
+    <w:p>
+      <w:pPr>
+        <w:spacing w:after="0" w:line="480" w:lineRule="auto"/>
+        <w:ind w:firstLine="720"/>
+      </w:pPr>
+      <w:r>
+        <w:rPr>
+          <w:rFonts w:ascii="Times New Roman" w:cs="Times New Roman" w:eastAsia="Times New Roman" w:hAnsi="Times New Roman"/>
+          <w:b/>
+          <w:bCs/>
+        </w:rPr>
+        <w:t xml:space="preserve">Results. </w:t>
+      </w:r>
+      <w:r>
+        <w:rPr>
+          <w:rFonts w:ascii="Times New Roman" w:cs="Times New Roman" w:eastAsia="Times New Roman" w:hAnsi="Times New Roman"/>
+          <w:b w:val="false"/>
+          <w:bCs w:val="false"/>
+          <w:i w:val="false"/>
+          <w:iCs w:val="false"/>
+        </w:rPr>
+        <w:t xml:space="preserve">We estimate Poisson regressions of marker counts on an indicator of LLM authorship, controlling for detected debt introduced, the logarithm of added lines, and quarter fixed effects, with standard errors clustered by month. LLM-authored commits carry far fewer markers. The incidence rate ratio is 0.02 (95% confidence interval 0.00 to 0.13) for the strict measure and 0.28 (0.14 to 0.56) for the broad one, and restricting the sample to the one maintainer or controlling for the number of added comment lines leaves the estimates essentially unchanged (Table 4). The gap does not arise because LLM commits contain fewer comments: they add 0.088 comment lines per added line, against 0.069 for human commits. Nor does it arise because LLM changes introduce less detected debt. The share of commits that raise the warning count is about 7.5 percent in both groups, and the number of markers per 100 new warnings is 0.2 for LLM-authored and 9.0 for human-authored commits on the strict measure, and 4.4 against 29.0 on the broad one.</w:t>
+      </w:r>
+    </w:p>
+    <w:p>
+      <w:pPr>
+        <w:keepNext/>
+        <w:spacing w:after="120" w:before="240" w:line="276"/>
+      </w:pPr>
+      <w:r>
+        <w:rPr>
+          <w:rFonts w:ascii="Times New Roman" w:cs="Times New Roman" w:eastAsia="Times New Roman" w:hAnsi="Times New Roman"/>
+          <w:b/>
+          <w:bCs/>
+          <w:i w:val="false"/>
+          <w:iCs w:val="false"/>
+        </w:rPr>
+        <w:t xml:space="preserve">Table 4. Pilot Test of P4: Self-Admitted Debt Markers in LLM-Authored versus Human-Authored Commits (Incidence Rate Ratios)</w:t>
+      </w:r>
+    </w:p>
+    <w:tbl>
+      <w:tblPr>
+        <w:tblW w:type="dxa" w:w="9360"/>
+        <w:tblBorders>
+          <w:top w:val="single" w:color="auto" w:sz="4"/>
+          <w:left w:val="single" w:color="auto" w:sz="4"/>
+          <w:bottom w:val="single" w:color="auto" w:sz="4"/>
+          <w:right w:val="single" w:color="auto" w:sz="4"/>
+          <w:insideH w:val="single" w:color="auto" w:sz="4"/>
+          <w:insideV w:val="single" w:color="auto" w:sz="4"/>
+        </w:tblBorders>
+      </w:tblPr>
+      <w:tblGrid>
+        <w:gridCol w:w="4200"/>
+        <w:gridCol w:w="1000"/>
+        <w:gridCol w:w="2080"/>
+        <w:gridCol w:w="2080"/>
+      </w:tblGrid>
+      <w:tr>
+        <w:trPr>
+          <w:cantSplit/>
+          <w:tblHeader/>
+        </w:trPr>
+        <w:tc>
+          <w:tcPr>
+            <w:tcW w:type="dxa" w:w="4200"/>
+            <w:tcBorders>
+              <w:top w:val="single" w:color="000000" w:sz="4"/>
+              <w:left w:val="single" w:color="000000" w:sz="4"/>
+              <w:bottom w:val="single" w:color="000000" w:sz="4"/>
+              <w:right w:val="single" w:color="000000" w:sz="4"/>
+            </w:tcBorders>
+            <w:shd w:fill="EDEDED" w:color="auto" w:val="clear"/>
+            <w:tcMar>
+              <w:top w:type="dxa" w:w="40"/>
+              <w:left w:type="dxa" w:w="80"/>
+              <w:bottom w:type="dxa" w:w="40"/>
+              <w:right w:type="dxa" w:w="80"/>
+            </w:tcMar>
+          </w:tcPr>
+          <w:p>
+            <w:pPr>
+              <w:spacing w:after="0" w:line="240"/>
+            </w:pPr>
+            <w:r>
+              <w:rPr>
+                <w:rFonts w:ascii="Times New Roman" w:cs="Times New Roman" w:eastAsia="Times New Roman" w:hAnsi="Times New Roman"/>
+                <w:b/>
+                <w:bCs/>
+                <w:i w:val="false"/>
+                <w:iCs w:val="false"/>
+                <w:sz w:val="20"/>
+                <w:szCs w:val="20"/>
+              </w:rPr>
+              <w:t xml:space="preserve">Specification</w:t>
+            </w:r>
+          </w:p>
+        </w:tc>
+        <w:tc>
+          <w:tcPr>
+            <w:tcW w:type="dxa" w:w="1000"/>
+            <w:tcBorders>
+              <w:top w:val="single" w:color="000000" w:sz="4"/>
+              <w:left w:val="single" w:color="000000" w:sz="4"/>
+              <w:bottom w:val="single" w:color="000000" w:sz="4"/>
+              <w:right w:val="single" w:color="000000" w:sz="4"/>
+            </w:tcBorders>
+            <w:shd w:fill="EDEDED" w:color="auto" w:val="clear"/>
+            <w:tcMar>
+              <w:top w:type="dxa" w:w="40"/>
+              <w:left w:type="dxa" w:w="80"/>
+              <w:bottom w:type="dxa" w:w="40"/>
+              <w:right w:type="dxa" w:w="80"/>
+            </w:tcMar>
+          </w:tcPr>
+          <w:p>
+            <w:pPr>
+              <w:spacing w:after="0" w:line="240"/>
+            </w:pPr>
+            <w:r>
+              <w:rPr>
+                <w:rFonts w:ascii="Times New Roman" w:cs="Times New Roman" w:eastAsia="Times New Roman" w:hAnsi="Times New Roman"/>
+                <w:b/>
+                <w:bCs/>
+                <w:i w:val="false"/>
+                <w:iCs w:val="false"/>
+                <w:sz w:val="20"/>
+                <w:szCs w:val="20"/>
+              </w:rPr>
+              <w:t xml:space="preserve">Commits</w:t>
+            </w:r>
+          </w:p>
+        </w:tc>
+        <w:tc>
+          <w:tcPr>
+            <w:tcW w:type="dxa" w:w="2080"/>
+            <w:tcBorders>
+              <w:top w:val="single" w:color="000000" w:sz="4"/>
+              <w:left w:val="single" w:color="000000" w:sz="4"/>
+              <w:bottom w:val="single" w:color="000000" w:sz="4"/>
+              <w:right w:val="single" w:color="000000" w:sz="4"/>
+            </w:tcBorders>
+            <w:shd w:fill="EDEDED" w:color="auto" w:val="clear"/>
+            <w:tcMar>
+              <w:top w:type="dxa" w:w="40"/>
+              <w:left w:type="dxa" w:w="80"/>
+              <w:bottom w:type="dxa" w:w="40"/>
+              <w:right w:type="dxa" w:w="80"/>
+            </w:tcMar>
+          </w:tcPr>
+          <w:p>
+            <w:pPr>
+              <w:spacing w:after="0" w:line="240"/>
+            </w:pPr>
+            <w:r>
+              <w:rPr>
+                <w:rFonts w:ascii="Times New Roman" w:cs="Times New Roman" w:eastAsia="Times New Roman" w:hAnsi="Times New Roman"/>
+                <w:b/>
+                <w:bCs/>
+                <w:i w:val="false"/>
+                <w:iCs w:val="false"/>
+                <w:sz w:val="20"/>
+                <w:szCs w:val="20"/>
+              </w:rPr>
+              <w:t xml:space="preserve">Strict markers (30 events)</w:t>
+            </w:r>
+          </w:p>
+        </w:tc>
+        <w:tc>
+          <w:tcPr>
+            <w:tcW w:type="dxa" w:w="2080"/>
+            <w:tcBorders>
+              <w:top w:val="single" w:color="000000" w:sz="4"/>
+              <w:left w:val="single" w:color="000000" w:sz="4"/>
+              <w:bottom w:val="single" w:color="000000" w:sz="4"/>
+              <w:right w:val="single" w:color="000000" w:sz="4"/>
+            </w:tcBorders>
+            <w:shd w:fill="EDEDED" w:color="auto" w:val="clear"/>
+            <w:tcMar>
+              <w:top w:type="dxa" w:w="40"/>
+              <w:left w:type="dxa" w:w="80"/>
+              <w:bottom w:type="dxa" w:w="40"/>
+              <w:right w:type="dxa" w:w="80"/>
+            </w:tcMar>
+          </w:tcPr>
+          <w:p>
+            <w:pPr>
+              <w:spacing w:after="0" w:line="240"/>
+            </w:pPr>
+            <w:r>
+              <w:rPr>
+                <w:rFonts w:ascii="Times New Roman" w:cs="Times New Roman" w:eastAsia="Times New Roman" w:hAnsi="Times New Roman"/>
+                <w:b/>
+                <w:bCs/>
+                <w:i w:val="false"/>
+                <w:iCs w:val="false"/>
+                <w:sz w:val="20"/>
+                <w:szCs w:val="20"/>
+              </w:rPr>
+              <w:t xml:space="preserve">Broad markers (121 events)</w:t>
+            </w:r>
+          </w:p>
+        </w:tc>
+      </w:tr>
+      <w:tr>
+        <w:trPr>
+          <w:cantSplit/>
+        </w:trPr>
+        <w:tc>
+          <w:tcPr>
+            <w:tcW w:type="dxa" w:w="4200"/>
+            <w:tcBorders>
+              <w:top w:val="single" w:color="000000" w:sz="4"/>
+              <w:left w:val="single" w:color="000000" w:sz="4"/>
+              <w:bottom w:val="single" w:color="000000" w:sz="4"/>
+              <w:right w:val="single" w:color="000000" w:sz="4"/>
+            </w:tcBorders>
+            <w:tcMar>
+              <w:top w:type="dxa" w:w="40"/>
+              <w:left w:type="dxa" w:w="80"/>
+              <w:bottom w:type="dxa" w:w="40"/>
+              <w:right w:type="dxa" w:w="80"/>
+            </w:tcMar>
+          </w:tcPr>
+          <w:p>
+            <w:pPr>
+              <w:spacing w:after="0" w:line="240"/>
+            </w:pPr>
+            <w:r>
+              <w:rPr>
+                <w:rFonts w:ascii="Times New Roman" w:cs="Times New Roman" w:eastAsia="Times New Roman" w:hAnsi="Times New Roman"/>
+                <w:b w:val="false"/>
+                <w:bCs w:val="false"/>
+                <w:i w:val="false"/>
+                <w:iCs w:val="false"/>
+                <w:sz w:val="20"/>
+                <w:szCs w:val="20"/>
+              </w:rPr>
+              <w:t xml:space="preserve">All authors</w:t>
+            </w:r>
+          </w:p>
+        </w:tc>
+        <w:tc>
+          <w:tcPr>
+            <w:tcW w:type="dxa" w:w="1000"/>
+            <w:tcBorders>
+              <w:top w:val="single" w:color="000000" w:sz="4"/>
+              <w:left w:val="single" w:color="000000" w:sz="4"/>
+              <w:bottom w:val="single" w:color="000000" w:sz="4"/>
+              <w:right w:val="single" w:color="000000" w:sz="4"/>
+            </w:tcBorders>
+            <w:tcMar>
+              <w:top w:type="dxa" w:w="40"/>
+              <w:left w:type="dxa" w:w="80"/>
+              <w:bottom w:type="dxa" w:w="40"/>
+              <w:right w:type="dxa" w:w="80"/>
+            </w:tcMar>
+          </w:tcPr>
+          <w:p>
+            <w:pPr>
+              <w:spacing w:after="0" w:line="240"/>
+            </w:pPr>
+            <w:r>
+              <w:rPr>
+                <w:rFonts w:ascii="Times New Roman" w:cs="Times New Roman" w:eastAsia="Times New Roman" w:hAnsi="Times New Roman"/>
+                <w:b w:val="false"/>
+                <w:bCs w:val="false"/>
+                <w:i w:val="false"/>
+                <w:iCs w:val="false"/>
+                <w:sz w:val="20"/>
+                <w:szCs w:val="20"/>
+              </w:rPr>
+              <w:t xml:space="preserve">4,936</w:t>
+            </w:r>
+          </w:p>
+        </w:tc>
+        <w:tc>
+          <w:tcPr>
+            <w:tcW w:type="dxa" w:w="2080"/>
+            <w:tcBorders>
+              <w:top w:val="single" w:color="000000" w:sz="4"/>
+              <w:left w:val="single" w:color="000000" w:sz="4"/>
+              <w:bottom w:val="single" w:color="000000" w:sz="4"/>
+              <w:right w:val="single" w:color="000000" w:sz="4"/>
+            </w:tcBorders>
+            <w:tcMar>
+              <w:top w:type="dxa" w:w="40"/>
+              <w:left w:type="dxa" w:w="80"/>
+              <w:bottom w:type="dxa" w:w="40"/>
+              <w:right w:type="dxa" w:w="80"/>
+            </w:tcMar>
+          </w:tcPr>
+          <w:p>
+            <w:pPr>
+              <w:spacing w:after="0" w:line="240"/>
+            </w:pPr>
+            <w:r>
+              <w:rPr>
+                <w:rFonts w:ascii="Times New Roman" w:cs="Times New Roman" w:eastAsia="Times New Roman" w:hAnsi="Times New Roman"/>
+                <w:b w:val="false"/>
+                <w:bCs w:val="false"/>
+                <w:i w:val="false"/>
+                <w:iCs w:val="false"/>
+                <w:sz w:val="20"/>
+                <w:szCs w:val="20"/>
+              </w:rPr>
+              <w:t xml:space="preserve">0.02 [0.00, 0.13]</w:t>
+            </w:r>
+          </w:p>
+        </w:tc>
+        <w:tc>
+          <w:tcPr>
+            <w:tcW w:type="dxa" w:w="2080"/>
+            <w:tcBorders>
+              <w:top w:val="single" w:color="000000" w:sz="4"/>
+              <w:left w:val="single" w:color="000000" w:sz="4"/>
+              <w:bottom w:val="single" w:color="000000" w:sz="4"/>
+              <w:right w:val="single" w:color="000000" w:sz="4"/>
+            </w:tcBorders>
+            <w:tcMar>
+              <w:top w:type="dxa" w:w="40"/>
+              <w:left w:type="dxa" w:w="80"/>
+              <w:bottom w:type="dxa" w:w="40"/>
+              <w:right w:type="dxa" w:w="80"/>
+            </w:tcMar>
+          </w:tcPr>
+          <w:p>
+            <w:pPr>
+              <w:spacing w:after="0" w:line="240"/>
+            </w:pPr>
+            <w:r>
+              <w:rPr>
+                <w:rFonts w:ascii="Times New Roman" w:cs="Times New Roman" w:eastAsia="Times New Roman" w:hAnsi="Times New Roman"/>
+                <w:b w:val="false"/>
+                <w:bCs w:val="false"/>
+                <w:i w:val="false"/>
+                <w:iCs w:val="false"/>
+                <w:sz w:val="20"/>
+                <w:szCs w:val="20"/>
+              </w:rPr>
+              <w:t xml:space="preserve">0.28 [0.14, 0.56]</w:t>
+            </w:r>
+          </w:p>
+        </w:tc>
+      </w:tr>
+      <w:tr>
+        <w:trPr>
+          <w:cantSplit/>
+        </w:trPr>
+        <w:tc>
+          <w:tcPr>
+            <w:tcW w:type="dxa" w:w="4200"/>
+            <w:tcBorders>
+              <w:top w:val="single" w:color="000000" w:sz="4"/>
+              <w:left w:val="single" w:color="000000" w:sz="4"/>
+              <w:bottom w:val="single" w:color="000000" w:sz="4"/>
+              <w:right w:val="single" w:color="000000" w:sz="4"/>
+            </w:tcBorders>
+            <w:tcMar>
+              <w:top w:type="dxa" w:w="40"/>
+              <w:left w:type="dxa" w:w="80"/>
+              <w:bottom w:type="dxa" w:w="40"/>
+              <w:right w:type="dxa" w:w="80"/>
+            </w:tcMar>
+          </w:tcPr>
+          <w:p>
+            <w:pPr>
+              <w:spacing w:after="0" w:line="240"/>
+            </w:pPr>
+            <w:r>
+              <w:rPr>
+                <w:rFonts w:ascii="Times New Roman" w:cs="Times New Roman" w:eastAsia="Times New Roman" w:hAnsi="Times New Roman"/>
+                <w:b w:val="false"/>
+                <w:bCs w:val="false"/>
+                <w:i w:val="false"/>
+                <w:iCs w:val="false"/>
+                <w:sz w:val="20"/>
+                <w:szCs w:val="20"/>
+              </w:rPr>
+              <w:t xml:space="preserve">One maintainer only</w:t>
+            </w:r>
+          </w:p>
+        </w:tc>
+        <w:tc>
+          <w:tcPr>
+            <w:tcW w:type="dxa" w:w="1000"/>
+            <w:tcBorders>
+              <w:top w:val="single" w:color="000000" w:sz="4"/>
+              <w:left w:val="single" w:color="000000" w:sz="4"/>
+              <w:bottom w:val="single" w:color="000000" w:sz="4"/>
+              <w:right w:val="single" w:color="000000" w:sz="4"/>
+            </w:tcBorders>
+            <w:tcMar>
+              <w:top w:type="dxa" w:w="40"/>
+              <w:left w:type="dxa" w:w="80"/>
+              <w:bottom w:type="dxa" w:w="40"/>
+              <w:right w:type="dxa" w:w="80"/>
+            </w:tcMar>
+          </w:tcPr>
+          <w:p>
+            <w:pPr>
+              <w:spacing w:after="0" w:line="240"/>
+            </w:pPr>
+            <w:r>
+              <w:rPr>
+                <w:rFonts w:ascii="Times New Roman" w:cs="Times New Roman" w:eastAsia="Times New Roman" w:hAnsi="Times New Roman"/>
+                <w:b w:val="false"/>
+                <w:bCs w:val="false"/>
+                <w:i w:val="false"/>
+                <w:iCs w:val="false"/>
+                <w:sz w:val="20"/>
+                <w:szCs w:val="20"/>
+              </w:rPr>
+              <w:t xml:space="preserve">4,707</w:t>
+            </w:r>
+          </w:p>
+        </w:tc>
+        <w:tc>
+          <w:tcPr>
+            <w:tcW w:type="dxa" w:w="2080"/>
+            <w:tcBorders>
+              <w:top w:val="single" w:color="000000" w:sz="4"/>
+              <w:left w:val="single" w:color="000000" w:sz="4"/>
+              <w:bottom w:val="single" w:color="000000" w:sz="4"/>
+              <w:right w:val="single" w:color="000000" w:sz="4"/>
+            </w:tcBorders>
+            <w:tcMar>
+              <w:top w:type="dxa" w:w="40"/>
+              <w:left w:type="dxa" w:w="80"/>
+              <w:bottom w:type="dxa" w:w="40"/>
+              <w:right w:type="dxa" w:w="80"/>
+            </w:tcMar>
+          </w:tcPr>
+          <w:p>
+            <w:pPr>
+              <w:spacing w:after="0" w:line="240"/>
+            </w:pPr>
+            <w:r>
+              <w:rPr>
+                <w:rFonts w:ascii="Times New Roman" w:cs="Times New Roman" w:eastAsia="Times New Roman" w:hAnsi="Times New Roman"/>
+                <w:b w:val="false"/>
+                <w:bCs w:val="false"/>
+                <w:i w:val="false"/>
+                <w:iCs w:val="false"/>
+                <w:sz w:val="20"/>
+                <w:szCs w:val="20"/>
+              </w:rPr>
+              <w:t xml:space="preserve">0.02 [0.00, 0.12]</w:t>
+            </w:r>
+          </w:p>
+        </w:tc>
+        <w:tc>
+          <w:tcPr>
+            <w:tcW w:type="dxa" w:w="2080"/>
+            <w:tcBorders>
+              <w:top w:val="single" w:color="000000" w:sz="4"/>
+              <w:left w:val="single" w:color="000000" w:sz="4"/>
+              <w:bottom w:val="single" w:color="000000" w:sz="4"/>
+              <w:right w:val="single" w:color="000000" w:sz="4"/>
+            </w:tcBorders>
+            <w:tcMar>
+              <w:top w:type="dxa" w:w="40"/>
+              <w:left w:type="dxa" w:w="80"/>
+              <w:bottom w:type="dxa" w:w="40"/>
+              <w:right w:type="dxa" w:w="80"/>
+            </w:tcMar>
+          </w:tcPr>
+          <w:p>
+            <w:pPr>
+              <w:spacing w:after="0" w:line="240"/>
+            </w:pPr>
+            <w:r>
+              <w:rPr>
+                <w:rFonts w:ascii="Times New Roman" w:cs="Times New Roman" w:eastAsia="Times New Roman" w:hAnsi="Times New Roman"/>
+                <w:b w:val="false"/>
+                <w:bCs w:val="false"/>
+                <w:i w:val="false"/>
+                <w:iCs w:val="false"/>
+                <w:sz w:val="20"/>
+                <w:szCs w:val="20"/>
+              </w:rPr>
+              <w:t xml:space="preserve">0.27 [0.14, 0.52]</w:t>
+            </w:r>
+          </w:p>
+        </w:tc>
+      </w:tr>
+      <w:tr>
+        <w:trPr>
+          <w:cantSplit/>
+        </w:trPr>
+        <w:tc>
+          <w:tcPr>
+            <w:tcW w:type="dxa" w:w="4200"/>
+            <w:tcBorders>
+              <w:top w:val="single" w:color="000000" w:sz="4"/>
+              <w:left w:val="single" w:color="000000" w:sz="4"/>
+              <w:bottom w:val="single" w:color="000000" w:sz="4"/>
+              <w:right w:val="single" w:color="000000" w:sz="4"/>
+            </w:tcBorders>
+            <w:tcMar>
+              <w:top w:type="dxa" w:w="40"/>
+              <w:left w:type="dxa" w:w="80"/>
+              <w:bottom w:type="dxa" w:w="40"/>
+              <w:right w:type="dxa" w:w="80"/>
+            </w:tcMar>
+          </w:tcPr>
+          <w:p>
+            <w:pPr>
+              <w:spacing w:after="0" w:line="240"/>
+            </w:pPr>
+            <w:r>
+              <w:rPr>
+                <w:rFonts w:ascii="Times New Roman" w:cs="Times New Roman" w:eastAsia="Times New Roman" w:hAnsi="Times New Roman"/>
+                <w:b w:val="false"/>
+                <w:bCs w:val="false"/>
+                <w:i w:val="false"/>
+                <w:iCs w:val="false"/>
+                <w:sz w:val="20"/>
+                <w:szCs w:val="20"/>
+              </w:rPr>
+              <w:t xml:space="preserve">Adding added comment lines as a control</w:t>
+            </w:r>
+          </w:p>
+        </w:tc>
+        <w:tc>
+          <w:tcPr>
+            <w:tcW w:type="dxa" w:w="1000"/>
+            <w:tcBorders>
+              <w:top w:val="single" w:color="000000" w:sz="4"/>
+              <w:left w:val="single" w:color="000000" w:sz="4"/>
+              <w:bottom w:val="single" w:color="000000" w:sz="4"/>
+              <w:right w:val="single" w:color="000000" w:sz="4"/>
+            </w:tcBorders>
+            <w:tcMar>
+              <w:top w:type="dxa" w:w="40"/>
+              <w:left w:type="dxa" w:w="80"/>
+              <w:bottom w:type="dxa" w:w="40"/>
+              <w:right w:type="dxa" w:w="80"/>
+            </w:tcMar>
+          </w:tcPr>
+          <w:p>
+            <w:pPr>
+              <w:spacing w:after="0" w:line="240"/>
+            </w:pPr>
+            <w:r>
+              <w:rPr>
+                <w:rFonts w:ascii="Times New Roman" w:cs="Times New Roman" w:eastAsia="Times New Roman" w:hAnsi="Times New Roman"/>
+                <w:b w:val="false"/>
+                <w:bCs w:val="false"/>
+                <w:i w:val="false"/>
+                <w:iCs w:val="false"/>
+                <w:sz w:val="20"/>
+                <w:szCs w:val="20"/>
+              </w:rPr>
+              <w:t xml:space="preserve">4,936</w:t>
+            </w:r>
+          </w:p>
+        </w:tc>
+        <w:tc>
+          <w:tcPr>
+            <w:tcW w:type="dxa" w:w="2080"/>
+            <w:tcBorders>
+              <w:top w:val="single" w:color="000000" w:sz="4"/>
+              <w:left w:val="single" w:color="000000" w:sz="4"/>
+              <w:bottom w:val="single" w:color="000000" w:sz="4"/>
+              <w:right w:val="single" w:color="000000" w:sz="4"/>
+            </w:tcBorders>
+            <w:tcMar>
+              <w:top w:type="dxa" w:w="40"/>
+              <w:left w:type="dxa" w:w="80"/>
+              <w:bottom w:type="dxa" w:w="40"/>
+              <w:right w:type="dxa" w:w="80"/>
+            </w:tcMar>
+          </w:tcPr>
+          <w:p>
+            <w:pPr>
+              <w:spacing w:after="0" w:line="240"/>
+            </w:pPr>
+            <w:r>
+              <w:rPr>
+                <w:rFonts w:ascii="Times New Roman" w:cs="Times New Roman" w:eastAsia="Times New Roman" w:hAnsi="Times New Roman"/>
+                <w:b w:val="false"/>
+                <w:bCs w:val="false"/>
+                <w:i w:val="false"/>
+                <w:iCs w:val="false"/>
+                <w:sz w:val="20"/>
+                <w:szCs w:val="20"/>
+              </w:rPr>
+              <w:t xml:space="preserve">0.02 [0.00, 0.12]</w:t>
+            </w:r>
+          </w:p>
+        </w:tc>
+        <w:tc>
+          <w:tcPr>
+            <w:tcW w:type="dxa" w:w="2080"/>
+            <w:tcBorders>
+              <w:top w:val="single" w:color="000000" w:sz="4"/>
+              <w:left w:val="single" w:color="000000" w:sz="4"/>
+              <w:bottom w:val="single" w:color="000000" w:sz="4"/>
+              <w:right w:val="single" w:color="000000" w:sz="4"/>
+            </w:tcBorders>
+            <w:tcMar>
+              <w:top w:type="dxa" w:w="40"/>
+              <w:left w:type="dxa" w:w="80"/>
+              <w:bottom w:type="dxa" w:w="40"/>
+              <w:right w:type="dxa" w:w="80"/>
+            </w:tcMar>
+          </w:tcPr>
+          <w:p>
+            <w:pPr>
+              <w:spacing w:after="0" w:line="240"/>
+            </w:pPr>
+            <w:r>
+              <w:rPr>
+                <w:rFonts w:ascii="Times New Roman" w:cs="Times New Roman" w:eastAsia="Times New Roman" w:hAnsi="Times New Roman"/>
+                <w:b w:val="false"/>
+                <w:bCs w:val="false"/>
+                <w:i w:val="false"/>
+                <w:iCs w:val="false"/>
+                <w:sz w:val="20"/>
+                <w:szCs w:val="20"/>
+              </w:rPr>
+              <w:t xml:space="preserve">0.32 [0.17, 0.60]</w:t>
+            </w:r>
+          </w:p>
+        </w:tc>
+      </w:tr>
+      <w:tr>
+        <w:trPr>
+          <w:cantSplit/>
+        </w:trPr>
+        <w:tc>
+          <w:tcPr>
+            <w:tcW w:type="dxa" w:w="4200"/>
+            <w:tcBorders>
+              <w:top w:val="single" w:color="000000" w:sz="4"/>
+              <w:left w:val="single" w:color="000000" w:sz="4"/>
+              <w:bottom w:val="single" w:color="000000" w:sz="4"/>
+              <w:right w:val="single" w:color="000000" w:sz="4"/>
+            </w:tcBorders>
+            <w:tcMar>
+              <w:top w:type="dxa" w:w="40"/>
+              <w:left w:type="dxa" w:w="80"/>
+              <w:bottom w:type="dxa" w:w="40"/>
+              <w:right w:type="dxa" w:w="80"/>
+            </w:tcMar>
+          </w:tcPr>
+          <w:p>
+            <w:pPr>
+              <w:spacing w:after="0" w:line="240"/>
+            </w:pPr>
+            <w:r>
+              <w:rPr>
+                <w:rFonts w:ascii="Times New Roman" w:cs="Times New Roman" w:eastAsia="Times New Roman" w:hAnsi="Times New Roman"/>
+                <w:b w:val="false"/>
+                <w:bCs w:val="false"/>
+                <w:i w:val="false"/>
+                <w:iCs w:val="false"/>
+                <w:sz w:val="20"/>
+                <w:szCs w:val="20"/>
+              </w:rPr>
+              <w:t xml:space="preserve">Excluding test- and benchmark-only commits</w:t>
+            </w:r>
+          </w:p>
+        </w:tc>
+        <w:tc>
+          <w:tcPr>
+            <w:tcW w:type="dxa" w:w="1000"/>
+            <w:tcBorders>
+              <w:top w:val="single" w:color="000000" w:sz="4"/>
+              <w:left w:val="single" w:color="000000" w:sz="4"/>
+              <w:bottom w:val="single" w:color="000000" w:sz="4"/>
+              <w:right w:val="single" w:color="000000" w:sz="4"/>
+            </w:tcBorders>
+            <w:tcMar>
+              <w:top w:type="dxa" w:w="40"/>
+              <w:left w:type="dxa" w:w="80"/>
+              <w:bottom w:type="dxa" w:w="40"/>
+              <w:right w:type="dxa" w:w="80"/>
+            </w:tcMar>
+          </w:tcPr>
+          <w:p>
+            <w:pPr>
+              <w:spacing w:after="0" w:line="240"/>
+            </w:pPr>
+            <w:r>
+              <w:rPr>
+                <w:rFonts w:ascii="Times New Roman" w:cs="Times New Roman" w:eastAsia="Times New Roman" w:hAnsi="Times New Roman"/>
+                <w:b w:val="false"/>
+                <w:bCs w:val="false"/>
+                <w:i w:val="false"/>
+                <w:iCs w:val="false"/>
+                <w:sz w:val="20"/>
+                <w:szCs w:val="20"/>
+              </w:rPr>
+              <w:t xml:space="preserve">3,867</w:t>
+            </w:r>
+          </w:p>
+        </w:tc>
+        <w:tc>
+          <w:tcPr>
+            <w:tcW w:type="dxa" w:w="2080"/>
+            <w:tcBorders>
+              <w:top w:val="single" w:color="000000" w:sz="4"/>
+              <w:left w:val="single" w:color="000000" w:sz="4"/>
+              <w:bottom w:val="single" w:color="000000" w:sz="4"/>
+              <w:right w:val="single" w:color="000000" w:sz="4"/>
+            </w:tcBorders>
+            <w:tcMar>
+              <w:top w:type="dxa" w:w="40"/>
+              <w:left w:type="dxa" w:w="80"/>
+              <w:bottom w:type="dxa" w:w="40"/>
+              <w:right w:type="dxa" w:w="80"/>
+            </w:tcMar>
+          </w:tcPr>
+          <w:p>
+            <w:pPr>
+              <w:spacing w:after="0" w:line="240"/>
+            </w:pPr>
+            <w:r>
+              <w:rPr>
+                <w:rFonts w:ascii="Times New Roman" w:cs="Times New Roman" w:eastAsia="Times New Roman" w:hAnsi="Times New Roman"/>
+                <w:b w:val="false"/>
+                <w:bCs w:val="false"/>
+                <w:i w:val="false"/>
+                <w:iCs w:val="false"/>
+                <w:sz w:val="20"/>
+                <w:szCs w:val="20"/>
+              </w:rPr>
+              <w:t xml:space="preserve">0.03 [0.01, 0.19]</w:t>
+            </w:r>
+          </w:p>
+        </w:tc>
+        <w:tc>
+          <w:tcPr>
+            <w:tcW w:type="dxa" w:w="2080"/>
+            <w:tcBorders>
+              <w:top w:val="single" w:color="000000" w:sz="4"/>
+              <w:left w:val="single" w:color="000000" w:sz="4"/>
+              <w:bottom w:val="single" w:color="000000" w:sz="4"/>
+              <w:right w:val="single" w:color="000000" w:sz="4"/>
+            </w:tcBorders>
+            <w:tcMar>
+              <w:top w:type="dxa" w:w="40"/>
+              <w:left w:type="dxa" w:w="80"/>
+              <w:bottom w:type="dxa" w:w="40"/>
+              <w:right w:type="dxa" w:w="80"/>
+            </w:tcMar>
+          </w:tcPr>
+          <w:p>
+            <w:pPr>
+              <w:spacing w:after="0" w:line="240"/>
+            </w:pPr>
+            <w:r>
+              <w:rPr>
+                <w:rFonts w:ascii="Times New Roman" w:cs="Times New Roman" w:eastAsia="Times New Roman" w:hAnsi="Times New Roman"/>
+                <w:b w:val="false"/>
+                <w:bCs w:val="false"/>
+                <w:i w:val="false"/>
+                <w:iCs w:val="false"/>
+                <w:sz w:val="20"/>
+                <w:szCs w:val="20"/>
+              </w:rPr>
+              <w:t xml:space="preserve">0.33 [0.16, 0.68]</w:t>
+            </w:r>
+          </w:p>
+        </w:tc>
+      </w:tr>
+    </w:tbl>
+    <w:p>
+      <w:pPr>
+        <w:spacing w:after="240" w:before="80" w:line="240"/>
+      </w:pPr>
+      <w:r>
+        <w:rPr>
+          <w:rFonts w:ascii="Times New Roman" w:cs="Times New Roman" w:eastAsia="Times New Roman" w:hAnsi="Times New Roman"/>
+          <w:b w:val="false"/>
+          <w:bCs w:val="false"/>
+          <w:i w:val="false"/>
+          <w:iCs w:val="false"/>
+          <w:sz w:val="20"/>
+          <w:szCs w:val="20"/>
+        </w:rPr>
+        <w:t xml:space="preserve">Note. Poisson regressions with controls for detected debt introduced, the logarithm of added lines, and quarter fixed effects; 95% confidence intervals in brackets, based on standard errors clustered by month. Values below 1 mean fewer markers in LLM-authored commits.</w:t>
+      </w:r>
+    </w:p>
+    <w:p>
+      <w:pPr>
+        <w:spacing w:after="0" w:before="0" w:line="480" w:lineRule="auto"/>
+        <w:ind w:firstLine="720"/>
+        <w:jc w:val="left"/>
+      </w:pPr>
+      <w:r>
+        <w:rPr>
+          <w:rFonts w:ascii="Times New Roman" w:cs="Times New Roman" w:eastAsia="Times New Roman" w:hAnsi="Times New Roman"/>
+          <w:b w:val="false"/>
+          <w:bCs w:val="false"/>
+          <w:i w:val="false"/>
+          <w:iCs w:val="false"/>
+        </w:rPr>
+        <w:t xml:space="preserve">The direction matches P4 and contradicts the prediction of rational acceleration that self-admission per unit of detected debt does not depend on authorship (Table 2). The evidence is weak in four respects. It comes from one repository and mainly one maintainer. The tool’s own prompts and conventions, which we did not examine, may discourage TODO comments, in which case the gap reflects tool design rather than the fluency mechanism. Developers choose which tasks to give the assistant, so authorship is not randomly assigned. And the comparison relies on a static-analysis proxy for debt: among the 373 commits that introduce new warnings, the strict measure yields only two events and is uninformative, while the broad measure yields 65 events for human-authored and 11 for LLM-authored commits. We therefore read the result as a consistency check that motivates the full design of Study 1, with several repositories identified through co-author trailers and agent-opened pull requests, and not as a test that the theory has passed. P7 requires review data from the platform’s interface and was not tested.</w:t>
       </w:r>
     </w:p>
     <w:p>
@@ -9987,7 +10838,7 @@
           <w:i w:val="false"/>
           <w:iCs w:val="false"/>
         </w:rPr>
-        <w:t xml:space="preserve">The theory and model are developed here rather than tested; the propositions and results await the evidence that the design in Section 5 would produce. The formal model is deliberately minimal. Tasks are independent, inspection detects defects perfectly, and the debt-trap result relies on a particular form of interest on debt, so its results are statements about mechanisms and not calibrated magnitudes. The strategic extensions abstract from competition among the organizations that use the tools, and they model learning only about the defect rate, not about the heuristic component of fluency, which may resist statistical evidence. The ownership and incentive mechanisms, and with them Propositions 6 and 9 to 11, are stated verbally rather than derived, and extending the formal model to teams is left for future work. The results also rest on regularity assumptions, namely continuous rework-cost and inspection-time distributions with positive density, a representative developer, and complete information in the game, and on a constant rework cost and uniform inspection time for the closed forms. Several measurement challenges also remain unresolved. AI-authorship labels are noisy and probably understate usage, which biases Study 1 estimates toward zero. Static-analysis measures of debt are proxies that may not track the debt developers experience. The experiment’s cover story may not fully reproduce field conditions in which reviewers know which tools their colleagues use. Finally, the theory is silent on model capability. A sufficiently capable model might produce code whose surface fluency is matched by its structure, and the fluency mechanism would then become harmless. The evidence to date, which finds structural degradation increasing with model capability, suggests that this point has not been reached, but the theory should be understood as conditional on the current gap between apparent and actual quality.</w:t>
+        <w:t xml:space="preserve">With the exception of the exploratory pilot test of P4 in Section 5.1, which covers a single repository, the theory and model are developed here rather than tested; the propositions and results await the evidence that the design in Section 5 would produce. The formal model is deliberately minimal. Tasks are independent, inspection detects defects perfectly, and the debt-trap result relies on a particular form of interest on debt, so its results are statements about mechanisms and not calibrated magnitudes. The strategic extensions abstract from competition among the organizations that use the tools, and they model learning only about the defect rate, not about the heuristic component of fluency, which may resist statistical evidence. The ownership and incentive mechanisms, and with them Propositions 6 and 9 to 11, are stated verbally rather than derived, and extending the formal model to teams is left for future work. The results also rest on regularity assumptions, namely continuous rework-cost and inspection-time distributions with positive density, a representative developer, and complete information in the game, and on a constant rework cost and uniform inspection time for the closed forms. Several measurement challenges also remain unresolved. AI-authorship labels are noisy and probably understate usage, which biases Study 1 estimates toward zero. Static-analysis measures of debt are proxies that may not track the debt developers experience. The experiment’s cover story may not fully reproduce field conditions in which reviewers know which tools their colleagues use. Finally, the theory is silent on model capability. A sufficiently capable model might produce code whose surface fluency is matched by its structure, and the fluency mechanism would then become harmless. The evidence to date, which finds structural degradation increasing with model capability, suggests that this point has not been reached, but the theory should be understood as conditional on the current gap between apparent and actual quality.</w:t>
       </w:r>
     </w:p>
     <w:p>
@@ -17609,27 +18460,27 @@
           <w:i w:val="false"/>
           <w:iCs w:val="false"/>
         </w:rPr>
-        <w:t xml:space="preserve">Alter, A. L., &amp; Oppenheimer, D. M. (2009). Uniting the tribes of fluency to form a metacognitive nation. </w:t>
-      </w:r>
-      <w:r>
-        <w:rPr>
-          <w:rFonts w:ascii="Times New Roman" w:cs="Times New Roman" w:eastAsia="Times New Roman" w:hAnsi="Times New Roman"/>
-          <w:b w:val="false"/>
-          <w:bCs w:val="false"/>
-          <w:i/>
-          <w:iCs/>
-        </w:rPr>
-        <w:t xml:space="preserve">Personality and Social Psychology Review, 13</w:t>
-      </w:r>
-      <w:r>
-        <w:rPr>
-          <w:rFonts w:ascii="Times New Roman" w:cs="Times New Roman" w:eastAsia="Times New Roman" w:hAnsi="Times New Roman"/>
-          <w:b w:val="false"/>
-          <w:bCs w:val="false"/>
-          <w:i w:val="false"/>
-          <w:iCs w:val="false"/>
-        </w:rPr>
-        <w:t xml:space="preserve">(3), 219–235.</w:t>
+        <w:t xml:space="preserve">Aider-AI. (2026). </w:t>
+      </w:r>
+      <w:r>
+        <w:rPr>
+          <w:rFonts w:ascii="Times New Roman" w:cs="Times New Roman" w:eastAsia="Times New Roman" w:hAnsi="Times New Roman"/>
+          <w:b w:val="false"/>
+          <w:bCs w:val="false"/>
+          <w:i/>
+          <w:iCs/>
+        </w:rPr>
+        <w:t xml:space="preserve">aider</w:t>
+      </w:r>
+      <w:r>
+        <w:rPr>
+          <w:rFonts w:ascii="Times New Roman" w:cs="Times New Roman" w:eastAsia="Times New Roman" w:hAnsi="Times New Roman"/>
+          <w:b w:val="false"/>
+          <w:bCs w:val="false"/>
+          <w:i w:val="false"/>
+          <w:iCs w:val="false"/>
+        </w:rPr>
+        <w:t xml:space="preserve"> [Source code repository]. GitHub. https://github.com/Aider-AI/aider</w:t>
       </w:r>
     </w:p>
     <w:p>
@@ -17645,6 +18496,42 @@
           <w:i w:val="false"/>
           <w:iCs w:val="false"/>
         </w:rPr>
+        <w:t xml:space="preserve">Alter, A. L., &amp; Oppenheimer, D. M. (2009). Uniting the tribes of fluency to form a metacognitive nation. </w:t>
+      </w:r>
+      <w:r>
+        <w:rPr>
+          <w:rFonts w:ascii="Times New Roman" w:cs="Times New Roman" w:eastAsia="Times New Roman" w:hAnsi="Times New Roman"/>
+          <w:b w:val="false"/>
+          <w:bCs w:val="false"/>
+          <w:i/>
+          <w:iCs/>
+        </w:rPr>
+        <w:t xml:space="preserve">Personality and Social Psychology Review, 13</w:t>
+      </w:r>
+      <w:r>
+        <w:rPr>
+          <w:rFonts w:ascii="Times New Roman" w:cs="Times New Roman" w:eastAsia="Times New Roman" w:hAnsi="Times New Roman"/>
+          <w:b w:val="false"/>
+          <w:bCs w:val="false"/>
+          <w:i w:val="false"/>
+          <w:iCs w:val="false"/>
+        </w:rPr>
+        <w:t xml:space="preserve">(3), 219–235.</w:t>
+      </w:r>
+    </w:p>
+    <w:p>
+      <w:pPr>
+        <w:spacing w:after="0" w:line="480" w:lineRule="auto"/>
+        <w:ind w:left="720" w:hanging="720"/>
+      </w:pPr>
+      <w:r>
+        <w:rPr>
+          <w:rFonts w:ascii="Times New Roman" w:cs="Times New Roman" w:eastAsia="Times New Roman" w:hAnsi="Times New Roman"/>
+          <w:b w:val="false"/>
+          <w:bCs w:val="false"/>
+          <w:i w:val="false"/>
+          <w:iCs w:val="false"/>
+        </w:rPr>
         <w:t xml:space="preserve">Arrow, K. J. (1963). Uncertainty and the welfare economics of medical care. </w:t>
       </w:r>
       <w:r>
@@ -17666,6 +18553,42 @@
           <w:iCs w:val="false"/>
         </w:rPr>
         <w:t xml:space="preserve">(5), 941–973.</w:t>
+      </w:r>
+    </w:p>
+    <w:p>
+      <w:pPr>
+        <w:spacing w:after="0" w:line="480" w:lineRule="auto"/>
+        <w:ind w:left="720" w:hanging="720"/>
+      </w:pPr>
+      <w:r>
+        <w:rPr>
+          <w:rFonts w:ascii="Times New Roman" w:cs="Times New Roman" w:eastAsia="Times New Roman" w:hAnsi="Times New Roman"/>
+          <w:b w:val="false"/>
+          <w:bCs w:val="false"/>
+          <w:i w:val="false"/>
+          <w:iCs w:val="false"/>
+        </w:rPr>
+        <w:t xml:space="preserve">Astral. (2026). </w:t>
+      </w:r>
+      <w:r>
+        <w:rPr>
+          <w:rFonts w:ascii="Times New Roman" w:cs="Times New Roman" w:eastAsia="Times New Roman" w:hAnsi="Times New Roman"/>
+          <w:b w:val="false"/>
+          <w:bCs w:val="false"/>
+          <w:i/>
+          <w:iCs/>
+        </w:rPr>
+        <w:t xml:space="preserve">Ruff</w:t>
+      </w:r>
+      <w:r>
+        <w:rPr>
+          <w:rFonts w:ascii="Times New Roman" w:cs="Times New Roman" w:eastAsia="Times New Roman" w:hAnsi="Times New Roman"/>
+          <w:b w:val="false"/>
+          <w:bCs w:val="false"/>
+          <w:i w:val="false"/>
+          <w:iCs w:val="false"/>
+        </w:rPr>
+        <w:t xml:space="preserve"> [Computer software]. https://github.com/astral-sh/ruff</w:t>
       </w:r>
     </w:p>
     <w:p>

</xml_diff>